<commit_message>
Lecture 15 and 16
</commit_message>
<xml_diff>
--- a/SOFTWARE ENGINEERING/Individual Assignments/IndividualAssignment3.docx
+++ b/SOFTWARE ENGINEERING/Individual Assignments/IndividualAssignment3.docx
@@ -255,7 +255,25 @@
           <w:sz w:val="24"/>
           <w:szCs w:val="24"/>
         </w:rPr>
-        <w:t>Your submission for this assignment should be in PDF format. You will submit your work to Brightspace. Ensure that your document is well-structured, with each section clearly addressing its respective task and providing necessary details as outlined in the assignment instructions.</w:t>
+        <w:t xml:space="preserve">Your submission for this assignment should be in PDF format. You will submit your work to </w:t>
+      </w:r>
+      <w:proofErr w:type="spellStart"/>
+      <w:r>
+        <w:rPr>
+          <w:rFonts w:cstheme="minorHAnsi"/>
+          <w:sz w:val="24"/>
+          <w:szCs w:val="24"/>
+        </w:rPr>
+        <w:t>Gradescope</w:t>
+      </w:r>
+      <w:proofErr w:type="spellEnd"/>
+      <w:r>
+        <w:rPr>
+          <w:rFonts w:cstheme="minorHAnsi"/>
+          <w:sz w:val="24"/>
+          <w:szCs w:val="24"/>
+        </w:rPr>
+        <w:t>. Ensure that your document is well-structured, with each section clearly addressing its respective task and providing necessary details as outlined in the assignment instructions.</w:t>
       </w:r>
     </w:p>
     <w:p>

</xml_diff>